<commit_message>
Trim Study 4 manuscript and slim journal submission zip
Reduce redundant Discussion prose and update data-availability wording now
that replication scripts are excluded from the ScholarOne package. Rebuild
Study4_COMPLETE_SUBMISSION.zip to 17 journal-required files (manuscript,
blinded version, title page, cover letter, tables, figures, supplementary
docx, and readme metadata). Main-text word count is 5218 (Introduction
through Conclusion, excluding title page, abstract, references, and
figure/table captions).

Co-authored-by: yuxuan980925 <yuxuan980925@users.noreply.github.com>
</commit_message>
<xml_diff>
--- a/Study4_IJCM_Submission/00_Manuscript_as_Submitted.docx
+++ b/Study4_IJCM_Submission/00_Manuscript_as_Submitted.docx
@@ -246,7 +246,7 @@
           <w:rFonts w:ascii="Times New Roman" w:hAnsi="Times New Roman" w:eastAsia="Times New Roman"/>
           <w:sz w:val="24"/>
         </w:rPr>
-        <w:t xml:space="preserve">A complete replication package accompanies this submission. All empirical specifications were rerun from the released data. The six main-text tables and five main-text figures report the results needed for the article; the accompanying supplementary-results set preserves all 34 generated tables, all 23 generated figures and the machine-readable coefficient files. Missing series are catalogued there; their absence is part of the claim boundary.</w:t>
+        <w:t xml:space="preserve">A complete replication package is available separately from the corresponding author. The six main-text tables and five main-text figures report the results needed for the article; supplementary tables and figures document the full estimation output. Missing series are catalogued in that package; their absence is part of the claim boundary.</w:t>
       </w:r>
     </w:p>
     <w:p>
@@ -2443,7 +2443,7 @@
           <w:rFonts w:ascii="Times New Roman" w:hAnsi="Times New Roman" w:eastAsia="Times New Roman"/>
           <w:sz w:val="24"/>
         </w:rPr>
-        <w:t xml:space="preserve">Keeping the UK at the centre of both country comparisons makes these distinctions clearer. The Indian relationship shows the strongest expansion in SJ3 and computer services, while the Chinese relationship grows from a smaller base and contains a larger construction-services flow. The EU members provide variation in adoption and industry outcomes; they are an estimation sample rather than additional country stories.</w:t>
+        <w:t xml:space="preserve">The UK-centred comparison clarifies scale as well as direction. UK imports from India rose by almost USD 2.8 billion in SJ3 between 2019 and 2024, compared with about USD 771 million from China; percentage changes in small construction flows should not be read as large reallocations of engineering activity. For firms, the pattern is consistent with lower coordination costs for digitally deliverable work—especially with Indian suppliers—rather than a simple domestic-versus-offshore location choice. Stable M71 employment makes a complete displacement account less persuasive, although the data cannot yet separate complementarity from substitution.</w:t>
       </w:r>
     </w:p>
     <w:p>
@@ -2457,7 +2457,7 @@
           <w:rFonts w:ascii="Times New Roman" w:hAnsi="Times New Roman" w:eastAsia="Times New Roman"/>
           <w:sz w:val="24"/>
         </w:rPr>
-        <w:t xml:space="preserve">The distinction also changes how the trade numbers should be read. UK imports from India rose by almost USD 2.8 billion in SJ3 between 2019 and 2024, whereas the increase in UK imports from China was about USD 771 million. A similar percentage coefficient in a panel regression would therefore imply very different changes in value. Conversely, rapid percentage growth in a small construction flow need not represent a large reallocation of engineering activity. The article reports both levels and rates to prevent a visually striking percentage from obscuring economic scale.</w:t>
+        <w:t xml:space="preserve">China plays different roles in the two empirical layers: as a bilateral partner in the descriptive section and as a supplier of comparison outcomes in the EU panel. The null Chinese construction coefficient therefore does not explain all UK–China trade; it shows only that EU importers with larger NLG shocks did not disproportionately increase that flow.</w:t>
       </w:r>
     </w:p>
     <w:p>
@@ -2471,7 +2471,7 @@
           <w:rFonts w:ascii="Times New Roman" w:hAnsi="Times New Roman" w:eastAsia="Times New Roman"/>
           <w:sz w:val="24"/>
         </w:rPr>
-        <w:t xml:space="preserve">For engineering businesses, the findings point to coordination rather than a simple location choice. Generative tools can lower the cost of preparing and checking documents, but they can also lower the cost of communicating requirements across organisational boundaries. The India coefficient may therefore reflect complementarity: importers that adopted NLG more rapidly may have become better able to specify, review or integrate work supplied from India. The available data cannot separate this channel from substitution, but stable M71 employment makes a complete displacement account less persuasive.</w:t>
+        <w:t xml:space="preserve">The results have practical implications for measurement. Researchers and policy analysts should not use construction-services trade as a proxy for remote engineering design, nor should they use a broad technical-services category as if every dollar were a civil-engineering invoice. Statistical agencies could materially improve analysis by publishing bilateral architectural and engineering services, enterprise AI use for M71, and consistent price indices for professional services. Until then, mode, service heading and direction of trade need to remain explicit.</w:t>
       </w:r>
     </w:p>
     <w:p>
@@ -2485,7 +2485,49 @@
           <w:rFonts w:ascii="Times New Roman" w:hAnsi="Times New Roman" w:eastAsia="Times New Roman"/>
           <w:sz w:val="24"/>
         </w:rPr>
-        <w:t xml:space="preserve">China’s role is different in each empirical layer. In the bilateral section, China is one of the UK’s two partners and both directions are measured for all three service headings. In the EU panel, China supplies comparison outcomes: SJ3 and construction services. Keeping those roles separate avoids the mistaken inference that the null Chinese construction coefficient explains all UK–China trade. It only shows that EU importers with larger NLG shocks did not disproportionately increase the Chinese construction flow.</w:t>
+        <w:t xml:space="preserve">The results therefore support a restrained interpretation (Table 6). Generative-AI adoption is associated with slower nominal growth in M71 activity among higher-adoption EU economies and increased technical-services imports from India. The UK–India and UK–China comparisons show where Britain’s bilateral service trade expanded, but they do not demonstrate that AI caused those changes, shifted civil-engineering jobs between the countries or changed national GDP.</w:t>
+      </w:r>
+    </w:p>
+    <w:p>
+      <w:pPr>
+        <w:spacing w:line="480" w:lineRule="auto" w:after="0"/>
+        <w:ind w:firstLine="0"/>
+      </w:pPr>
+      <w:r>
+        <w:pict>
+          <v:rect style="width:0;height:1.5pt" o:hralign="center" o:hrstd="t" o:hr="t"/>
+        </w:pict>
+      </w:r>
+    </w:p>
+    <w:bookmarkEnd w:id="48"/>
+    <w:bookmarkStart w:id="49" w:name="limitations"/>
+    <w:p>
+      <w:pPr>
+        <w:pStyle w:val="Heading2"/>
+        <w:spacing w:line="480" w:lineRule="auto"/>
+        <w:ind w:firstLine="0"/>
+      </w:pPr>
+      <w:r>
+        <w:rPr>
+          <w:rFonts w:ascii="Times New Roman" w:hAnsi="Times New Roman" w:eastAsia="Times New Roman"/>
+          <w:b/>
+          <w:sz w:val="24"/>
+        </w:rPr>
+        <w:t xml:space="preserve">7. Limitations</w:t>
+      </w:r>
+    </w:p>
+    <w:p>
+      <w:pPr>
+        <w:pStyle w:val="FirstParagraph"/>
+        <w:spacing w:line="480" w:lineRule="auto" w:after="0"/>
+        <w:ind w:firstLine="720"/>
+      </w:pPr>
+      <w:r>
+        <w:rPr>
+          <w:rFonts w:ascii="Times New Roman" w:hAnsi="Times New Roman" w:eastAsia="Times New Roman"/>
+          <w:sz w:val="24"/>
+        </w:rPr>
+        <w:t xml:space="preserve">Several data constraints set the boundary of the study. Eurostat does not publish NLG adoption for M71 itself, so adoption in the broader NACE M sector is used as a proxy. Changes in NLG adoption in other sectors also predict SJ3 imports, which means the trade treatment captures a national generative-AI wave rather than an intervention confined to engineering consultancies.</w:t>
       </w:r>
     </w:p>
     <w:p>
@@ -2499,7 +2541,7 @@
           <w:rFonts w:ascii="Times New Roman" w:hAnsi="Times New Roman" w:eastAsia="Times New Roman"/>
           <w:sz w:val="24"/>
         </w:rPr>
-        <w:t xml:space="preserve">The results have practical implications for measurement. Researchers and policy analysts should not use construction-services trade as a proxy for remote engineering design, nor should they use a broad technical-services category as if every dollar were a civil-engineering invoice. Statistical agencies could materially improve analysis by publishing bilateral architectural and engineering services, enterprise AI use for M71, and consistent price indices for professional services. Until then, mode, service heading and direction of trade need to remain explicit.</w:t>
+        <w:t xml:space="preserve">The trade category is also broad. BaTIS SJ3 includes technical, trade-related and other business services, while bilateral SJ312 architectural and engineering services are unavailable. The positive India estimate may therefore contain non-engineering activity. No bilateral series records employment in ISCO 2142, so the analysis cannot trace civil-engineering jobs between India, China and the UK.</w:t>
       </w:r>
     </w:p>
     <w:p>
@@ -2513,7 +2555,21 @@
           <w:rFonts w:ascii="Times New Roman" w:hAnsi="Times New Roman" w:eastAsia="Times New Roman"/>
           <w:sz w:val="24"/>
         </w:rPr>
-        <w:t xml:space="preserve">The results therefore support a restrained interpretation (Table 6). Generative-AI adoption is associated with slower nominal growth in M71 activity among higher-adoption EU economies and increased technical-services imports from India. The UK–India and UK–China comparisons show where Britain’s bilateral service trade expanded, but they do not demonstrate that AI caused those changes, shifted civil-engineering jobs between the countries or changed national GDP.</w:t>
+        <w:t xml:space="preserve">The time dimension is short. BaTIS ends in 2024, and Structural Business Statistics provide only one complete post-shock year. The industry models rely on 17 country clusters, and their outcomes are in current prices. Construction turnover shares the negative association found for M71, making it difficult to separate an engineering-specific response from broader national conditions.</w:t>
+      </w:r>
+    </w:p>
+    <w:p>
+      <w:pPr>
+        <w:pStyle w:val="BodyText"/>
+        <w:spacing w:line="480" w:lineRule="auto" w:after="0"/>
+        <w:ind w:firstLine="720"/>
+      </w:pPr>
+      <w:r>
+        <w:rPr>
+          <w:rFonts w:ascii="Times New Roman" w:hAnsi="Times New Roman" w:eastAsia="Times New Roman"/>
+          <w:sz w:val="24"/>
+        </w:rPr>
+        <w:t xml:space="preserve">These limitations are not repaired by filling missing observations. No country, occupation, industry or GDP cell is interpolated. Unsuccessful retrievals, including M71-specific AI adoption and more detailed engineering trade and employment series, remain documented in the data inventory. Additional post-shock years and more precise service classifications are needed before the associations reported here can support stronger causal claims.</w:t>
       </w:r>
     </w:p>
     <w:p>
@@ -2527,8 +2583,8 @@
         </w:pict>
       </w:r>
     </w:p>
-    <w:bookmarkEnd w:id="48"/>
-    <w:bookmarkStart w:id="49" w:name="limitations"/>
+    <w:bookmarkEnd w:id="49"/>
+    <w:bookmarkStart w:id="50" w:name="conclusion"/>
     <w:p>
       <w:pPr>
         <w:pStyle w:val="Heading2"/>
@@ -2541,7 +2597,7 @@
           <w:b/>
           <w:sz w:val="24"/>
         </w:rPr>
-        <w:t xml:space="preserve">7. Limitations</w:t>
+        <w:t xml:space="preserve">8. Conclusion</w:t>
       </w:r>
     </w:p>
     <w:p>
@@ -2555,7 +2611,7 @@
           <w:rFonts w:ascii="Times New Roman" w:hAnsi="Times New Roman" w:eastAsia="Times New Roman"/>
           <w:sz w:val="24"/>
         </w:rPr>
-        <w:t xml:space="preserve">Several data constraints set the boundary of the study. Eurostat does not publish NLG adoption for M71 itself, so adoption in the broader NACE M sector is used as a proxy. Changes in NLG adoption in other sectors also predict SJ3 imports, which means the trade treatment captures a national generative-AI wave rather than an intervention confined to engineering consultancies.</w:t>
+        <w:t xml:space="preserve">The UK’s service relationships with both India and China expanded between 2019 and 2024, but they did so differently. UK–India SJ3 grew strongly in both directions, with UK imports from India rising most. UK imports of Chinese SJ3 also almost doubled, while the reverse flow grew more moderately. Construction services remained comparatively small in both relationships.</w:t>
       </w:r>
     </w:p>
     <w:p>
@@ -2569,7 +2625,7 @@
           <w:rFonts w:ascii="Times New Roman" w:hAnsi="Times New Roman" w:eastAsia="Times New Roman"/>
           <w:sz w:val="24"/>
         </w:rPr>
-        <w:t xml:space="preserve">The trade category is also broad. BaTIS SJ3 includes technical, trade-related and other business services, while bilateral SJ312 architectural and engineering services are unavailable. The positive India estimate may therefore contain non-engineering activity. No bilateral series records employment in ISCO 2142, so the analysis cannot trace civil-engineering jobs between India, China and the UK.</w:t>
+        <w:t xml:space="preserve">The harmonised EU panel links higher importer NLG adoption to Indian SJ3 but not to Chinese construction services. Domestic M71 turnover and wages also grew more slowly in higher-adoption economies, while employment was unchanged. These findings are consistent with a changing digitally deliverable services margin, not with a general construction-trade effect.</w:t>
       </w:r>
     </w:p>
     <w:p>
@@ -2583,21 +2639,7 @@
           <w:rFonts w:ascii="Times New Roman" w:hAnsi="Times New Roman" w:eastAsia="Times New Roman"/>
           <w:sz w:val="24"/>
         </w:rPr>
-        <w:t xml:space="preserve">The time dimension is short. BaTIS ends in 2024, and Structural Business Statistics provide only one complete post-shock year. The industry models rely on 17 country clusters, and their outcomes are in current prices. Construction turnover shares the negative association found for M71, making it difficult to separate an engineering-specific response from broader national conditions.</w:t>
-      </w:r>
-    </w:p>
-    <w:p>
-      <w:pPr>
-        <w:pStyle w:val="BodyText"/>
-        <w:spacing w:line="480" w:lineRule="auto" w:after="0"/>
-        <w:ind w:firstLine="720"/>
-      </w:pPr>
-      <w:r>
-        <w:rPr>
-          <w:rFonts w:ascii="Times New Roman" w:hAnsi="Times New Roman" w:eastAsia="Times New Roman"/>
-          <w:sz w:val="24"/>
-        </w:rPr>
-        <w:t xml:space="preserve">These limitations are not repaired by filling missing observations. No country, occupation, industry or GDP cell is interpolated. Unsuccessful retrievals, including M71-specific AI adoption and more detailed engineering trade and employment series, remain documented in the data inventory. Additional post-shock years and more precise service classifications are needed before the associations reported here can support stronger causal claims.</w:t>
+        <w:t xml:space="preserve">The conclusion remains conditional. The bilateral comparisons do not have a UK NLG treatment, SJ3 is broader than engineering, and the industry panel has only one complete post-shock year. The paper therefore documents UK–India and UK–China service changes and places them beside the NLG panel evidence; it does not claim that AI caused bilateral civil-engineering relocation (Table 6).</w:t>
       </w:r>
     </w:p>
     <w:p>
@@ -2611,8 +2653,8 @@
         </w:pict>
       </w:r>
     </w:p>
-    <w:bookmarkEnd w:id="49"/>
-    <w:bookmarkStart w:id="50" w:name="conclusion"/>
+    <w:bookmarkEnd w:id="50"/>
+    <w:bookmarkStart w:id="51" w:name="author-contribution"/>
     <w:p>
       <w:pPr>
         <w:pStyle w:val="Heading2"/>
@@ -2625,7 +2667,7 @@
           <w:b/>
           <w:sz w:val="24"/>
         </w:rPr>
-        <w:t xml:space="preserve">8. Conclusion</w:t>
+        <w:t xml:space="preserve">Author contribution</w:t>
       </w:r>
     </w:p>
     <w:p>
@@ -2639,50 +2681,11 @@
           <w:rFonts w:ascii="Times New Roman" w:hAnsi="Times New Roman" w:eastAsia="Times New Roman"/>
           <w:sz w:val="24"/>
         </w:rPr>
-        <w:t xml:space="preserve">The UK’s service relationships with both India and China expanded between 2019 and 2024, but they did so differently. UK–India SJ3 grew strongly in both directions, with UK imports from India rising most. UK imports of Chinese SJ3 also almost doubled, while the reverse flow grew more moderately. Construction services remained comparatively small in both relationships.</w:t>
-      </w:r>
-    </w:p>
-    <w:p>
-      <w:pPr>
-        <w:pStyle w:val="BodyText"/>
-        <w:spacing w:line="480" w:lineRule="auto" w:after="0"/>
-        <w:ind w:firstLine="720"/>
-      </w:pPr>
-      <w:r>
-        <w:rPr>
-          <w:rFonts w:ascii="Times New Roman" w:hAnsi="Times New Roman" w:eastAsia="Times New Roman"/>
-          <w:sz w:val="24"/>
-        </w:rPr>
-        <w:t xml:space="preserve">The harmonised EU panel links higher importer NLG adoption to Indian SJ3 but not to Chinese construction services. Domestic M71 turnover and wages also grew more slowly in higher-adoption economies, while employment was unchanged. These findings are consistent with a changing digitally deliverable services margin, not with a general construction-trade effect.</w:t>
-      </w:r>
-    </w:p>
-    <w:p>
-      <w:pPr>
-        <w:pStyle w:val="BodyText"/>
-        <w:spacing w:line="480" w:lineRule="auto" w:after="0"/>
-        <w:ind w:firstLine="720"/>
-      </w:pPr>
-      <w:r>
-        <w:rPr>
-          <w:rFonts w:ascii="Times New Roman" w:hAnsi="Times New Roman" w:eastAsia="Times New Roman"/>
-          <w:sz w:val="24"/>
-        </w:rPr>
-        <w:t xml:space="preserve">The conclusion remains conditional. The bilateral comparisons do not have a UK NLG treatment, SJ3 is broader than engineering, and the industry panel has only one complete post-shock year. The paper therefore documents UK–India and UK–China service changes and places them beside the NLG panel evidence; it does not claim that AI caused bilateral civil-engineering relocation (Table 6).</w:t>
-      </w:r>
-    </w:p>
-    <w:p>
-      <w:pPr>
-        <w:spacing w:line="480" w:lineRule="auto" w:after="0"/>
-        <w:ind w:firstLine="0"/>
-      </w:pPr>
-      <w:r>
-        <w:pict>
-          <v:rect style="width:0;height:1.5pt" o:hralign="center" o:hrstd="t" o:hr="t"/>
-        </w:pict>
-      </w:r>
-    </w:p>
-    <w:bookmarkEnd w:id="50"/>
-    <w:bookmarkStart w:id="51" w:name="author-contribution"/>
+        <w:t xml:space="preserve">Yuxuan Chai is the sole author and was responsible for the study conception, data curation, analysis, visualisation and manuscript preparation.</w:t>
+      </w:r>
+    </w:p>
+    <w:bookmarkEnd w:id="51"/>
+    <w:bookmarkStart w:id="52" w:name="funding"/>
     <w:p>
       <w:pPr>
         <w:pStyle w:val="Heading2"/>
@@ -2695,7 +2698,7 @@
           <w:b/>
           <w:sz w:val="24"/>
         </w:rPr>
-        <w:t xml:space="preserve">Author contribution</w:t>
+        <w:t xml:space="preserve">Funding</w:t>
       </w:r>
     </w:p>
     <w:p>
@@ -2709,11 +2712,11 @@
           <w:rFonts w:ascii="Times New Roman" w:hAnsi="Times New Roman" w:eastAsia="Times New Roman"/>
           <w:sz w:val="24"/>
         </w:rPr>
-        <w:t xml:space="preserve">Yuxuan Chai is the sole author and was responsible for the study conception, data curation, analysis, visualisation and manuscript preparation.</w:t>
-      </w:r>
-    </w:p>
-    <w:bookmarkEnd w:id="51"/>
-    <w:bookmarkStart w:id="52" w:name="funding"/>
+        <w:t xml:space="preserve">This research received no specific grant from any funding agency in the public, commercial or not-for-profit sectors.</w:t>
+      </w:r>
+    </w:p>
+    <w:bookmarkEnd w:id="52"/>
+    <w:bookmarkStart w:id="53" w:name="ethics-statement"/>
     <w:p>
       <w:pPr>
         <w:pStyle w:val="Heading2"/>
@@ -2726,7 +2729,7 @@
           <w:b/>
           <w:sz w:val="24"/>
         </w:rPr>
-        <w:t xml:space="preserve">Funding</w:t>
+        <w:t xml:space="preserve">Ethics statement</w:t>
       </w:r>
     </w:p>
     <w:p>
@@ -2740,11 +2743,11 @@
           <w:rFonts w:ascii="Times New Roman" w:hAnsi="Times New Roman" w:eastAsia="Times New Roman"/>
           <w:sz w:val="24"/>
         </w:rPr>
-        <w:t xml:space="preserve">This research received no specific grant from any funding agency in the public, commercial or not-for-profit sectors.</w:t>
-      </w:r>
-    </w:p>
-    <w:bookmarkEnd w:id="52"/>
-    <w:bookmarkStart w:id="53" w:name="ethics-statement"/>
+        <w:t xml:space="preserve">The study analyses published aggregate statistical series and does not involve human participants, personal data or animal subjects.</w:t>
+      </w:r>
+    </w:p>
+    <w:bookmarkEnd w:id="53"/>
+    <w:bookmarkStart w:id="54" w:name="disclosure-statement"/>
     <w:p>
       <w:pPr>
         <w:pStyle w:val="Heading2"/>
@@ -2757,7 +2760,7 @@
           <w:b/>
           <w:sz w:val="24"/>
         </w:rPr>
-        <w:t xml:space="preserve">Ethics statement</w:t>
+        <w:t xml:space="preserve">Disclosure statement</w:t>
       </w:r>
     </w:p>
     <w:p>
@@ -2771,11 +2774,11 @@
           <w:rFonts w:ascii="Times New Roman" w:hAnsi="Times New Roman" w:eastAsia="Times New Roman"/>
           <w:sz w:val="24"/>
         </w:rPr>
-        <w:t xml:space="preserve">The study analyses published aggregate statistical series and does not involve human participants, personal data or animal subjects.</w:t>
-      </w:r>
-    </w:p>
-    <w:bookmarkEnd w:id="53"/>
-    <w:bookmarkStart w:id="54" w:name="disclosure-statement"/>
+        <w:t xml:space="preserve">No potential conflict of interest was reported by the author.</w:t>
+      </w:r>
+    </w:p>
+    <w:bookmarkEnd w:id="54"/>
+    <w:bookmarkStart w:id="55" w:name="data-availability-statement"/>
     <w:p>
       <w:pPr>
         <w:pStyle w:val="Heading2"/>
@@ -2788,7 +2791,7 @@
           <w:b/>
           <w:sz w:val="24"/>
         </w:rPr>
-        <w:t xml:space="preserve">Disclosure statement</w:t>
+        <w:t xml:space="preserve">Data availability statement</w:t>
       </w:r>
     </w:p>
     <w:p>
@@ -2802,53 +2805,7 @@
           <w:rFonts w:ascii="Times New Roman" w:hAnsi="Times New Roman" w:eastAsia="Times New Roman"/>
           <w:sz w:val="24"/>
         </w:rPr>
-        <w:t xml:space="preserve">No potential conflict of interest was reported by the author.</w:t>
-      </w:r>
-    </w:p>
-    <w:bookmarkEnd w:id="54"/>
-    <w:bookmarkStart w:id="55" w:name="data-availability-statement"/>
-    <w:p>
-      <w:pPr>
-        <w:pStyle w:val="Heading2"/>
-        <w:spacing w:line="480" w:lineRule="auto"/>
-        <w:ind w:firstLine="0"/>
-      </w:pPr>
-      <w:r>
-        <w:rPr>
-          <w:rFonts w:ascii="Times New Roman" w:hAnsi="Times New Roman" w:eastAsia="Times New Roman"/>
-          <w:b/>
-          <w:sz w:val="24"/>
-        </w:rPr>
-        <w:t xml:space="preserve">Data availability statement</w:t>
-      </w:r>
-    </w:p>
-    <w:p>
-      <w:pPr>
-        <w:pStyle w:val="FirstParagraph"/>
-        <w:spacing w:line="480" w:lineRule="auto" w:after="0"/>
-        <w:ind w:firstLine="720"/>
-      </w:pPr>
-      <w:r>
-        <w:rPr>
-          <w:rFonts w:ascii="Times New Roman" w:hAnsi="Times New Roman" w:eastAsia="Times New Roman"/>
-          <w:sz w:val="24"/>
-        </w:rPr>
-        <w:t xml:space="preserve">The data that support the findings of this study are included in the accompanying replication package (</w:t>
-      </w:r>
-      <w:r>
-        <w:rPr>
-          <w:rStyle w:val="VerbatimChar"/>
-          <w:rFonts w:ascii="Times New Roman" w:hAnsi="Times New Roman" w:eastAsia="Times New Roman"/>
-          <w:sz w:val="24"/>
-        </w:rPr>
-        <w:t xml:space="preserve">Data_Study4_IJCM/</w:t>
-      </w:r>
-      <w:r>
-        <w:rPr>
-          <w:rFonts w:ascii="Times New Roman" w:hAnsi="Times New Roman" w:eastAsia="Times New Roman"/>
-          <w:sz w:val="24"/>
-        </w:rPr>
-        <w:t xml:space="preserve">). Eurostat, OECD–WTO BaTIS and ILOSTAT series remain subject to their publishers’ terms and should be cited as in the reference list. Author-generated files are released under CC BY 4.0.</w:t>
+        <w:t xml:space="preserve">The findings draw on Eurostat, OECD–WTO BaTIS and ILOSTAT series, which remain subject to their publishers’ terms and should be cited as in the reference list. Supplementary tables and figures reproduce the derived estimates; the full replication package is available from the corresponding author on request. Author-generated files are released under CC BY 4.0.</w:t>
       </w:r>
     </w:p>
     <w:bookmarkEnd w:id="55"/>

</xml_diff>